<commit_message>
Add burst max safety limit to halt unbounded continue-ramp
Phase 2 (continue ramp after hold) previously had no cap on the
setpoint — only the existing HighLimit protection on actual pressure
would trip as a fault, with no way to distinguish "specimen burst" from
"specimen survived to rated max" from the PC side.

New PP_Water_BurstMaxLimit / PP_Oil_BurstMaxLimit (set 0 to disable).
When the burst setpoint reaches the limit in phase 2, clamp the
setpoint, mark BurstPhase=4 (max reached, no burst), and transition
to state 4 for clean ramp-down. BurstResult stays 0 in this case so
PC can distinguish: phase=3 ⇒ burst at BurstResult; phase=4 ⇒
survived to BurstMaxLimit without bursting.

TCP_PC_to_PLC slots 180-183 (was reserved) now carry the two limits.
Doc updated with new rows and a changelog entry.
</commit_message>
<xml_diff>
--- a/压力脉冲控制器TCP-IP通讯协议表V4.0.docx
+++ b/压力脉冲控制器TCP-IP通讯协议表V4.0.docx
@@ -500,6 +500,56 @@
           <w:lang w:eastAsia="zh-CN"/>
         </w:rPr>
         <w:t>15. ★ 滤波时间常数调整：水路 50ms→20ms，油路 100ms→50ms；16. ★ 冲洗排气拆分水/剂两路独立控制（油路输出 +3V/−0.5V）</w:t>
+      </w:r>
+      <w:proofErr w:type="gramStart"/>
+      <w:r>
+        <w:rPr>
+          <w:lang w:eastAsia="zh-CN"/>
+        </w:rPr>
+      </w:r>
+      <w:proofErr w:type="gramEnd"/>
+      <w:r>
+        <w:rPr>
+          <w:lang w:eastAsia="zh-CN"/>
+        </w:rPr>
+      </w:r>
+      <w:proofErr w:type="spellStart"/>
+      <w:r>
+        <w:rPr>
+          <w:lang w:eastAsia="zh-CN"/>
+        </w:rPr>
+      </w:r>
+      <w:proofErr w:type="spellEnd"/>
+      <w:r>
+        <w:rPr>
+          <w:lang w:eastAsia="zh-CN"/>
+        </w:rPr>
+      </w:r>
+      <w:proofErr w:type="gramStart"/>
+      <w:r>
+        <w:rPr>
+          <w:lang w:eastAsia="zh-CN"/>
+        </w:rPr>
+      </w:r>
+      <w:proofErr w:type="gramEnd"/>
+      <w:r>
+        <w:rPr>
+          <w:lang w:eastAsia="zh-CN"/>
+        </w:rPr>
+      </w:r>
+    </w:p>
+    <w:p>
+      <w:pPr>
+        <w:rPr>
+          <w:rFonts w:hint="eastAsia"/>
+          <w:lang w:eastAsia="zh-CN"/>
+        </w:rPr>
+      </w:pPr>
+      <w:r>
+        <w:rPr>
+          <w:lang w:eastAsia="zh-CN"/>
+        </w:rPr>
+        <w:t>17. ★ 新增爆破最大安全压力 BurstMaxLimit（WORD 180-183），到限自动停机并标记 BurstPhase=4</w:t>
       </w:r>
       <w:proofErr w:type="gramStart"/>
       <w:r>
@@ -17762,6 +17812,136 @@
             <w:tcW w:w="2468" w:type="dxa"/>
           </w:tcPr>
           <w:p>
+            <w:r>
+              <w:t>180-181</w:t>
+            </w:r>
+          </w:p>
+        </w:tc>
+        <w:tc>
+          <w:tcPr>
+            <w:tcW w:w="2460" w:type="dxa"/>
+          </w:tcPr>
+          <w:p>
+            <w:r>
+              <w:t>4</w:t>
+            </w:r>
+          </w:p>
+        </w:tc>
+        <w:tc>
+          <w:tcPr>
+            <w:tcW w:w="3016" w:type="dxa"/>
+          </w:tcPr>
+          <w:p>
+            <w:r>
+              <w:t>PP_Water_BurstMaxLimit</w:t>
+            </w:r>
+          </w:p>
+        </w:tc>
+        <w:tc>
+          <w:tcPr>
+            <w:tcW w:w="2474" w:type="dxa"/>
+          </w:tcPr>
+          <w:p>
+            <w:r>
+              <w:t>FLOAT32</w:t>
+            </w:r>
+          </w:p>
+        </w:tc>
+        <w:tc>
+          <w:tcPr>
+            <w:tcW w:w="2466" w:type="dxa"/>
+          </w:tcPr>
+          <w:p>
+            <w:r>
+              <w:t>MPa</w:t>
+            </w:r>
+          </w:p>
+        </w:tc>
+        <w:tc>
+          <w:tcPr>
+            <w:tcW w:w="2470" w:type="dxa"/>
+          </w:tcPr>
+          <w:p>
+            <w:r>
+              <w:t>★ 水路爆破最大安全压力（给定值到此停机，避免无限升压）</w:t>
+            </w:r>
+          </w:p>
+        </w:tc>
+      </w:tr>
+      <w:tr>
+        <w:trPr>
+          <w:jc w:val="center"/>
+        </w:trPr>
+        <w:tc>
+          <w:tcPr>
+            <w:tcW w:w="2468" w:type="dxa"/>
+          </w:tcPr>
+          <w:p>
+            <w:r>
+              <w:t>182-183</w:t>
+            </w:r>
+          </w:p>
+        </w:tc>
+        <w:tc>
+          <w:tcPr>
+            <w:tcW w:w="2460" w:type="dxa"/>
+          </w:tcPr>
+          <w:p>
+            <w:r>
+              <w:t>4</w:t>
+            </w:r>
+          </w:p>
+        </w:tc>
+        <w:tc>
+          <w:tcPr>
+            <w:tcW w:w="3016" w:type="dxa"/>
+          </w:tcPr>
+          <w:p>
+            <w:r>
+              <w:t>PP_Oil_BurstMaxLimit</w:t>
+            </w:r>
+          </w:p>
+        </w:tc>
+        <w:tc>
+          <w:tcPr>
+            <w:tcW w:w="2474" w:type="dxa"/>
+          </w:tcPr>
+          <w:p>
+            <w:r>
+              <w:t>FLOAT32</w:t>
+            </w:r>
+          </w:p>
+        </w:tc>
+        <w:tc>
+          <w:tcPr>
+            <w:tcW w:w="2466" w:type="dxa"/>
+          </w:tcPr>
+          <w:p>
+            <w:r>
+              <w:t>MPa</w:t>
+            </w:r>
+          </w:p>
+        </w:tc>
+        <w:tc>
+          <w:tcPr>
+            <w:tcW w:w="2470" w:type="dxa"/>
+          </w:tcPr>
+          <w:p>
+            <w:r>
+              <w:t>★ 油路爆破最大安全压力（给定值到此停机，避免无限升压）</w:t>
+            </w:r>
+          </w:p>
+        </w:tc>
+      </w:tr>
+      <w:tr>
+        <w:trPr>
+          <w:jc w:val="center"/>
+        </w:trPr>
+        <w:tc>
+          <w:tcPr>
+            <w:tcW w:w="2468" w:type="dxa"/>
+          </w:tcPr>
+          <w:p>
             <w:pPr>
               <w:rPr>
                 <w:rFonts w:hint="eastAsia"/>
@@ -40514,7 +40694,7 @@
           </w:tcPr>
           <w:p>
             <w:r>
-              <w:t>★ 水路爆破相位 0=升压 1=保压 2=续升 3=已爆破</w:t>
+              <w:t>★ 水路爆破相位 0=升压 1=保压 2=续升 3=已爆破 4=到上限未爆破</w:t>
             </w:r>
           </w:p>
         </w:tc>
@@ -40644,7 +40824,7 @@
           </w:tcPr>
           <w:p>
             <w:r>
-              <w:t>★ 油路爆破相位 0=升压 1=保压 2=续升 3=已爆破</w:t>
+              <w:t>★ 油路爆破相位 0=升压 1=保压 2=续升 3=已爆破 4=到上限未爆破</w:t>
             </w:r>
           </w:p>
         </w:tc>

</xml_diff>

<commit_message>
Rename burst RiseTime → RiseRate, use rate directly
Switched the burst initial-ramp parameter from "time to reach
BurstPressure" (s) to "rise rate" (MPa/s). The runtime formerly
divided BurstPressure / RiseTime each cycle; now it reads the rate
directly. Slot addresses (62-63 water, 110-111 oil) and the safety
fallback (0.01 MPa/s when ≤ 0) are unchanged.

Doc rows updated to reflect the new name, unit, and meaning.
</commit_message>
<xml_diff>
--- a/压力脉冲控制器TCP-IP通讯协议表V4.0.docx
+++ b/压力脉冲控制器TCP-IP通讯协议表V4.0.docx
@@ -4332,7 +4332,7 @@
           </w:tcPr>
           <w:p>
             <w:r>
-              <w:t>PP_Water_RiseTime</w:t>
+              <w:t>PP_Water_RiseRate</w:t>
             </w:r>
           </w:p>
         </w:tc>
@@ -4352,7 +4352,7 @@
           </w:tcPr>
           <w:p>
             <w:r>
-              <w:t>s</w:t>
+              <w:t>MPa/s</w:t>
             </w:r>
           </w:p>
         </w:tc>
@@ -4362,7 +4362,7 @@
           </w:tcPr>
           <w:p>
             <w:r>
-              <w:t>水路爆破上升时间（0→BurstPressure）</w:t>
+              <w:t>★ 水路爆破升压速率（初始 0→BurstPressure 阶段）</w:t>
             </w:r>
           </w:p>
         </w:tc>
@@ -6461,7 +6461,7 @@
           </w:tcPr>
           <w:p>
             <w:r>
-              <w:t>PP_Oil_RiseTime</w:t>
+              <w:t>PP_Oil_RiseRate</w:t>
             </w:r>
           </w:p>
         </w:tc>
@@ -6481,7 +6481,7 @@
           </w:tcPr>
           <w:p>
             <w:r>
-              <w:t>s</w:t>
+              <w:t>MPa/s</w:t>
             </w:r>
           </w:p>
         </w:tc>
@@ -6491,7 +6491,7 @@
           </w:tcPr>
           <w:p>
             <w:r>
-              <w:t>油路爆破上升时间（0→BurstPressure）</w:t>
+              <w:t>★ 油路爆破升压速率（初始 0→BurstPressure 阶段）</w:t>
             </w:r>
           </w:p>
         </w:tc>

</xml_diff>

<commit_message>
Move BurstMaxLimit into the burst block, push CycleReset to 180/182
Swap WORD addresses so the four burst parameters sit together at
60-67 (water) / 108-115 (oil) instead of being split across the
register map.

  WORD 66-67  / 114-115:  BurstMaxLimit  (was CycleReset)
  WORD 180-181/ 182-183:  CycleReset     (was BurstMaxLimit)

PRG and GVL reference these by name, only the TCP map and the doc
needed updating.
</commit_message>
<xml_diff>
--- a/压力脉冲控制器TCP-IP通讯协议表V4.0.docx
+++ b/压力脉冲控制器TCP-IP通讯协议表V4.0.docx
@@ -4496,7 +4496,7 @@
           </w:tcPr>
           <w:p>
             <w:r>
-              <w:t>PP_Water_CycleReset</w:t>
+              <w:t>PP_Water_BurstMaxLimit</w:t>
             </w:r>
           </w:p>
         </w:tc>
@@ -4516,7 +4516,7 @@
           </w:tcPr>
           <w:p>
             <w:r>
-              <w:t>-</w:t>
+              <w:t>MPa</w:t>
             </w:r>
           </w:p>
         </w:tc>
@@ -4526,7 +4526,7 @@
           </w:tcPr>
           <w:p>
             <w:r>
-              <w:t>★ 水路循环计数清零命令（上升沿有效）</w:t>
+              <w:t>★ 水路爆破最大安全压力（给定值到此停机，避免无限升压）</w:t>
             </w:r>
           </w:p>
         </w:tc>
@@ -6625,7 +6625,7 @@
           </w:tcPr>
           <w:p>
             <w:r>
-              <w:t>PP_Oil_CycleReset</w:t>
+              <w:t>PP_Oil_BurstMaxLimit</w:t>
             </w:r>
           </w:p>
         </w:tc>
@@ -6645,7 +6645,7 @@
           </w:tcPr>
           <w:p>
             <w:r>
-              <w:t>-</w:t>
+              <w:t>MPa</w:t>
             </w:r>
           </w:p>
         </w:tc>
@@ -6655,7 +6655,7 @@
           </w:tcPr>
           <w:p>
             <w:r>
-              <w:t>★ 油路循环计数清零命令（上升沿有效）</w:t>
+              <w:t>★ 油路爆破最大安全压力（给定值到此停机，避免无限升压）</w:t>
             </w:r>
           </w:p>
         </w:tc>
@@ -17833,7 +17833,7 @@
           </w:tcPr>
           <w:p>
             <w:r>
-              <w:t>PP_Water_BurstMaxLimit</w:t>
+              <w:t>PP_Water_CycleReset</w:t>
             </w:r>
           </w:p>
         </w:tc>
@@ -17853,7 +17853,7 @@
           </w:tcPr>
           <w:p>
             <w:r>
-              <w:t>MPa</w:t>
+              <w:t>-</w:t>
             </w:r>
           </w:p>
         </w:tc>
@@ -17863,7 +17863,7 @@
           </w:tcPr>
           <w:p>
             <w:r>
-              <w:t>★ 水路爆破最大安全压力（给定值到此停机，避免无限升压）</w:t>
+              <w:t>★ 水路循环计数清零命令（上升沿有效）</w:t>
             </w:r>
           </w:p>
         </w:tc>
@@ -17898,7 +17898,7 @@
           </w:tcPr>
           <w:p>
             <w:r>
-              <w:t>PP_Oil_BurstMaxLimit</w:t>
+              <w:t>PP_Oil_CycleReset</w:t>
             </w:r>
           </w:p>
         </w:tc>
@@ -17918,7 +17918,7 @@
           </w:tcPr>
           <w:p>
             <w:r>
-              <w:t>MPa</w:t>
+              <w:t>-</w:t>
             </w:r>
           </w:p>
         </w:tc>
@@ -17928,7 +17928,7 @@
           </w:tcPr>
           <w:p>
             <w:r>
-              <w:t>★ 油路爆破最大安全压力（给定值到此停机，避免无限升压）</w:t>
+              <w:t>★ 油路循环计数清零命令（上升沿有效）</w:t>
             </w:r>
           </w:p>
         </w:tc>

</xml_diff>

<commit_message>
Drop BurstRate2: continue-ramp phase reuses RiseRate
The continue-ramp rate was a separate parameter that defaulted back
to RiseRate when ≤ 0. In practice the burst test runs one steady
rate end-to-end, so the second parameter just clutters the protocol.

Removed PP_*_BurstRate2 from GVL, dropped rBurstRate2_W/O locals,
and changed phase-2 setpoint update in both Run* methods to use
rBurstRate1 directly. TCP slots 176-179 marked as 保留.
</commit_message>
<xml_diff>
--- a/压力脉冲控制器TCP-IP通讯协议表V4.0.docx
+++ b/压力脉冲控制器TCP-IP通讯协议表V4.0.docx
@@ -17675,7 +17675,7 @@
           </w:tcPr>
           <w:p>
             <w:r>
-              <w:t>PP_Water_BurstRate2</w:t>
+              <w:t>保留</w:t>
             </w:r>
           </w:p>
         </w:tc>
@@ -17695,7 +17695,7 @@
           </w:tcPr>
           <w:p>
             <w:r>
-              <w:t>MPa/s</w:t>
+              <w:t>-</w:t>
             </w:r>
           </w:p>
         </w:tc>
@@ -17705,7 +17705,7 @@
           </w:tcPr>
           <w:p>
             <w:r>
-              <w:t>★ 水路爆破续升速率（保压后继续升压用）</w:t>
+              <w:t>原 PP_Water_BurstRate2，V4.0 起续升沿用 RiseRate</w:t>
             </w:r>
           </w:p>
         </w:tc>
@@ -17768,7 +17768,7 @@
           </w:tcPr>
           <w:p>
             <w:r>
-              <w:t>PP_Oil_BurstRate2</w:t>
+              <w:t>保留</w:t>
             </w:r>
           </w:p>
         </w:tc>
@@ -17788,7 +17788,7 @@
           </w:tcPr>
           <w:p>
             <w:r>
-              <w:t>MPa/s</w:t>
+              <w:t>-</w:t>
             </w:r>
           </w:p>
         </w:tc>
@@ -17798,7 +17798,7 @@
           </w:tcPr>
           <w:p>
             <w:r>
-              <w:t>★ 油路爆破续升速率</w:t>
+              <w:t>原 PP_Oil_BurstRate2，V4.0 起续升沿用 RiseRate</w:t>
             </w:r>
           </w:p>
         </w:tc>

</xml_diff>

<commit_message>
Strip orphan 180-181/182-183 保留 rows in V4 protocol doc
When BurstMaxLimit moved from 180/182 to 66/114, the originally
inserted rows at 180/182 became duplicates of the swap-target rows
(now holding CycleReset). Removed only those two orphans, keeping
the legitimate multi-row bit-encoded IO entries at 140-143.
</commit_message>
<xml_diff>
--- a/压力脉冲控制器TCP-IP通讯协议表V4.0.docx
+++ b/压力脉冲控制器TCP-IP通讯协议表V4.0.docx
@@ -17929,276 +17929,6 @@
           <w:p>
             <w:r>
               <w:t>★ 油路循环计数清零命令（上升沿有效）</w:t>
-            </w:r>
-          </w:p>
-        </w:tc>
-      </w:tr>
-      <w:tr>
-        <w:trPr>
-          <w:jc w:val="center"/>
-        </w:trPr>
-        <w:tc>
-          <w:tcPr>
-            <w:tcW w:w="2468" w:type="dxa"/>
-          </w:tcPr>
-          <w:p>
-            <w:pPr>
-              <w:rPr>
-                <w:rFonts w:hint="eastAsia"/>
-                <w:sz w:val="18"/>
-                <w:highlight w:val="magenta"/>
-                <w:lang w:eastAsia="zh-CN"/>
-              </w:rPr>
-            </w:pPr>
-            <w:r>
-              <w:rPr>
-                <w:rFonts w:hint="eastAsia"/>
-                <w:sz w:val="18"/>
-                <w:highlight w:val="magenta"/>
-                <w:lang w:eastAsia="zh-CN"/>
-              </w:rPr>
-              <w:t>180-181</w:t>
-            </w:r>
-          </w:p>
-        </w:tc>
-        <w:tc>
-          <w:tcPr>
-            <w:tcW w:w="2460" w:type="dxa"/>
-          </w:tcPr>
-          <w:p>
-            <w:pPr>
-              <w:rPr>
-                <w:rFonts w:hint="eastAsia"/>
-                <w:sz w:val="18"/>
-                <w:highlight w:val="magenta"/>
-                <w:lang w:eastAsia="zh-CN"/>
-              </w:rPr>
-            </w:pPr>
-            <w:r>
-              <w:rPr>
-                <w:rFonts w:hint="eastAsia"/>
-                <w:sz w:val="18"/>
-                <w:highlight w:val="magenta"/>
-                <w:lang w:eastAsia="zh-CN"/>
-              </w:rPr>
-              <w:t>4</w:t>
-            </w:r>
-          </w:p>
-        </w:tc>
-        <w:tc>
-          <w:tcPr>
-            <w:tcW w:w="3016" w:type="dxa"/>
-          </w:tcPr>
-          <w:p>
-            <w:pPr>
-              <w:rPr>
-                <w:rFonts w:hint="eastAsia"/>
-                <w:sz w:val="18"/>
-                <w:highlight w:val="magenta"/>
-                <w:lang w:eastAsia="zh-CN"/>
-              </w:rPr>
-            </w:pPr>
-            <w:r>
-              <w:rPr>
-                <w:rFonts w:hint="eastAsia"/>
-                <w:sz w:val="18"/>
-                <w:highlight w:val="magenta"/>
-                <w:lang w:eastAsia="zh-CN"/>
-              </w:rPr>
-              <w:t>保留</w:t>
-            </w:r>
-          </w:p>
-        </w:tc>
-        <w:tc>
-          <w:tcPr>
-            <w:tcW w:w="2474" w:type="dxa"/>
-          </w:tcPr>
-          <w:p>
-            <w:pPr>
-              <w:rPr>
-                <w:rFonts w:hint="eastAsia"/>
-                <w:sz w:val="18"/>
-                <w:highlight w:val="magenta"/>
-              </w:rPr>
-            </w:pPr>
-            <w:r>
-              <w:rPr>
-                <w:sz w:val="18"/>
-                <w:highlight w:val="magenta"/>
-              </w:rPr>
-              <w:t>FLOAT32</w:t>
-            </w:r>
-          </w:p>
-        </w:tc>
-        <w:tc>
-          <w:tcPr>
-            <w:tcW w:w="2466" w:type="dxa"/>
-          </w:tcPr>
-          <w:p>
-            <w:pPr>
-              <w:rPr>
-                <w:rFonts w:hint="eastAsia"/>
-                <w:lang w:eastAsia="zh-CN"/>
-              </w:rPr>
-            </w:pPr>
-          </w:p>
-        </w:tc>
-        <w:tc>
-          <w:tcPr>
-            <w:tcW w:w="2470" w:type="dxa"/>
-          </w:tcPr>
-          <w:p>
-            <w:pPr>
-              <w:rPr>
-                <w:rFonts w:hint="eastAsia"/>
-                <w:sz w:val="18"/>
-                <w:highlight w:val="magenta"/>
-                <w:lang w:eastAsia="zh-CN"/>
-              </w:rPr>
-            </w:pPr>
-            <w:r>
-              <w:rPr>
-                <w:rFonts w:hint="eastAsia"/>
-                <w:sz w:val="18"/>
-                <w:highlight w:val="magenta"/>
-                <w:lang w:eastAsia="zh-CN"/>
-              </w:rPr>
-              <w:t>-</w:t>
-            </w:r>
-          </w:p>
-        </w:tc>
-      </w:tr>
-      <w:tr>
-        <w:trPr>
-          <w:jc w:val="center"/>
-        </w:trPr>
-        <w:tc>
-          <w:tcPr>
-            <w:tcW w:w="2468" w:type="dxa"/>
-          </w:tcPr>
-          <w:p>
-            <w:pPr>
-              <w:rPr>
-                <w:rFonts w:hint="eastAsia"/>
-                <w:sz w:val="18"/>
-                <w:highlight w:val="magenta"/>
-                <w:lang w:eastAsia="zh-CN"/>
-              </w:rPr>
-            </w:pPr>
-            <w:r>
-              <w:rPr>
-                <w:rFonts w:hint="eastAsia"/>
-                <w:sz w:val="18"/>
-                <w:highlight w:val="magenta"/>
-                <w:lang w:eastAsia="zh-CN"/>
-              </w:rPr>
-              <w:t>182-183</w:t>
-            </w:r>
-          </w:p>
-        </w:tc>
-        <w:tc>
-          <w:tcPr>
-            <w:tcW w:w="2460" w:type="dxa"/>
-          </w:tcPr>
-          <w:p>
-            <w:pPr>
-              <w:rPr>
-                <w:rFonts w:hint="eastAsia"/>
-                <w:sz w:val="18"/>
-                <w:highlight w:val="magenta"/>
-                <w:lang w:eastAsia="zh-CN"/>
-              </w:rPr>
-            </w:pPr>
-            <w:r>
-              <w:rPr>
-                <w:rFonts w:hint="eastAsia"/>
-                <w:sz w:val="18"/>
-                <w:highlight w:val="magenta"/>
-                <w:lang w:eastAsia="zh-CN"/>
-              </w:rPr>
-              <w:t>4</w:t>
-            </w:r>
-          </w:p>
-        </w:tc>
-        <w:tc>
-          <w:tcPr>
-            <w:tcW w:w="3016" w:type="dxa"/>
-          </w:tcPr>
-          <w:p>
-            <w:pPr>
-              <w:rPr>
-                <w:rFonts w:hint="eastAsia"/>
-                <w:sz w:val="18"/>
-                <w:highlight w:val="magenta"/>
-                <w:lang w:eastAsia="zh-CN"/>
-              </w:rPr>
-            </w:pPr>
-            <w:r>
-              <w:rPr>
-                <w:rFonts w:hint="eastAsia"/>
-                <w:sz w:val="18"/>
-                <w:highlight w:val="magenta"/>
-                <w:lang w:eastAsia="zh-CN"/>
-              </w:rPr>
-              <w:t>保留</w:t>
-            </w:r>
-          </w:p>
-        </w:tc>
-        <w:tc>
-          <w:tcPr>
-            <w:tcW w:w="2474" w:type="dxa"/>
-          </w:tcPr>
-          <w:p>
-            <w:pPr>
-              <w:rPr>
-                <w:rFonts w:hint="eastAsia"/>
-                <w:sz w:val="18"/>
-                <w:highlight w:val="magenta"/>
-              </w:rPr>
-            </w:pPr>
-            <w:r>
-              <w:rPr>
-                <w:sz w:val="18"/>
-                <w:highlight w:val="magenta"/>
-              </w:rPr>
-              <w:t>FLOAT32</w:t>
-            </w:r>
-          </w:p>
-        </w:tc>
-        <w:tc>
-          <w:tcPr>
-            <w:tcW w:w="2466" w:type="dxa"/>
-          </w:tcPr>
-          <w:p>
-            <w:pPr>
-              <w:rPr>
-                <w:rFonts w:hint="eastAsia"/>
-                <w:lang w:eastAsia="zh-CN"/>
-              </w:rPr>
-            </w:pPr>
-          </w:p>
-        </w:tc>
-        <w:tc>
-          <w:tcPr>
-            <w:tcW w:w="2470" w:type="dxa"/>
-          </w:tcPr>
-          <w:p>
-            <w:pPr>
-              <w:rPr>
-                <w:rFonts w:hint="eastAsia"/>
-                <w:sz w:val="18"/>
-                <w:highlight w:val="magenta"/>
-                <w:lang w:eastAsia="zh-CN"/>
-              </w:rPr>
-            </w:pPr>
-            <w:r>
-              <w:rPr>
-                <w:rFonts w:hint="eastAsia"/>
-                <w:sz w:val="18"/>
-                <w:highlight w:val="magenta"/>
-                <w:lang w:eastAsia="zh-CN"/>
-              </w:rPr>
-              <w:t>-</w:t>
             </w:r>
           </w:p>
         </w:tc>

</xml_diff>

<commit_message>
Doc V4.0: add multi-segment burst + dedicated burst PID rows
Table 1 (PC→PLC) gains the new burst rows:
  184-191: Burst_Kp / Burst_Ki (water + oil)
  192-195: BurstHoldCount (water + oil)
  1800-1879: BurstHoldP[1..10] and BurstHoldT[1..10] (water + oil)
Wave-upload range trimmed to 200-1799 to reflect that 1800-1879 now
carry burst hold data; 1880-1999 remains reserved.

Changelog gets three new bullets (18-20) covering the multi-segment
hold, dedicated burst PID gains, and the hold-only Ki strategy.
</commit_message>
<xml_diff>
--- a/压力脉冲控制器TCP-IP通讯协议表V4.0.docx
+++ b/压力脉冲控制器TCP-IP通讯协议表V4.0.docx
@@ -550,6 +550,156 @@
           <w:lang w:eastAsia="zh-CN"/>
         </w:rPr>
         <w:t>17. ★ 新增爆破最大安全压力 BurstMaxLimit（WORD 180-183），到限自动停机并标记 BurstPhase=4</w:t>
+      </w:r>
+      <w:proofErr w:type="gramStart"/>
+      <w:r>
+        <w:rPr>
+          <w:lang w:eastAsia="zh-CN"/>
+        </w:rPr>
+      </w:r>
+      <w:proofErr w:type="gramEnd"/>
+      <w:r>
+        <w:rPr>
+          <w:lang w:eastAsia="zh-CN"/>
+        </w:rPr>
+      </w:r>
+      <w:proofErr w:type="spellStart"/>
+      <w:r>
+        <w:rPr>
+          <w:lang w:eastAsia="zh-CN"/>
+        </w:rPr>
+      </w:r>
+      <w:proofErr w:type="spellEnd"/>
+      <w:r>
+        <w:rPr>
+          <w:lang w:eastAsia="zh-CN"/>
+        </w:rPr>
+      </w:r>
+      <w:proofErr w:type="gramStart"/>
+      <w:r>
+        <w:rPr>
+          <w:lang w:eastAsia="zh-CN"/>
+        </w:rPr>
+      </w:r>
+      <w:proofErr w:type="gramEnd"/>
+      <w:r>
+        <w:rPr>
+          <w:lang w:eastAsia="zh-CN"/>
+        </w:rPr>
+      </w:r>
+    </w:p>
+    <w:p>
+      <w:pPr>
+        <w:rPr>
+          <w:rFonts w:hint="eastAsia"/>
+          <w:lang w:eastAsia="zh-CN"/>
+        </w:rPr>
+      </w:pPr>
+      <w:r>
+        <w:rPr>
+          <w:lang w:eastAsia="zh-CN"/>
+        </w:rPr>
+        <w:t>18. ★ 爆破保压改为多段（N ≤ 10）：上位机写 BurstHoldCount + BurstHoldP[1..10] + BurstHoldT[1..10]</w:t>
+      </w:r>
+      <w:proofErr w:type="gramStart"/>
+      <w:r>
+        <w:rPr>
+          <w:lang w:eastAsia="zh-CN"/>
+        </w:rPr>
+      </w:r>
+      <w:proofErr w:type="gramEnd"/>
+      <w:r>
+        <w:rPr>
+          <w:lang w:eastAsia="zh-CN"/>
+        </w:rPr>
+      </w:r>
+      <w:proofErr w:type="spellStart"/>
+      <w:r>
+        <w:rPr>
+          <w:lang w:eastAsia="zh-CN"/>
+        </w:rPr>
+      </w:r>
+      <w:proofErr w:type="spellEnd"/>
+      <w:r>
+        <w:rPr>
+          <w:lang w:eastAsia="zh-CN"/>
+        </w:rPr>
+      </w:r>
+      <w:proofErr w:type="gramStart"/>
+      <w:r>
+        <w:rPr>
+          <w:lang w:eastAsia="zh-CN"/>
+        </w:rPr>
+      </w:r>
+      <w:proofErr w:type="gramEnd"/>
+      <w:r>
+        <w:rPr>
+          <w:lang w:eastAsia="zh-CN"/>
+        </w:rPr>
+      </w:r>
+    </w:p>
+    <w:p>
+      <w:pPr>
+        <w:rPr>
+          <w:rFonts w:hint="eastAsia"/>
+          <w:lang w:eastAsia="zh-CN"/>
+        </w:rPr>
+      </w:pPr>
+      <w:r>
+        <w:rPr>
+          <w:lang w:eastAsia="zh-CN"/>
+        </w:rPr>
+        <w:t>19. ★ 爆破 PID 独立 Kp/Ki（PP_*_Burst_Kp/Ki，WORD 184-191），与脉冲 PID 分离</w:t>
+      </w:r>
+      <w:proofErr w:type="gramStart"/>
+      <w:r>
+        <w:rPr>
+          <w:lang w:eastAsia="zh-CN"/>
+        </w:rPr>
+      </w:r>
+      <w:proofErr w:type="gramEnd"/>
+      <w:r>
+        <w:rPr>
+          <w:lang w:eastAsia="zh-CN"/>
+        </w:rPr>
+      </w:r>
+      <w:proofErr w:type="spellStart"/>
+      <w:r>
+        <w:rPr>
+          <w:lang w:eastAsia="zh-CN"/>
+        </w:rPr>
+      </w:r>
+      <w:proofErr w:type="spellEnd"/>
+      <w:r>
+        <w:rPr>
+          <w:lang w:eastAsia="zh-CN"/>
+        </w:rPr>
+      </w:r>
+      <w:proofErr w:type="gramStart"/>
+      <w:r>
+        <w:rPr>
+          <w:lang w:eastAsia="zh-CN"/>
+        </w:rPr>
+      </w:r>
+      <w:proofErr w:type="gramEnd"/>
+      <w:r>
+        <w:rPr>
+          <w:lang w:eastAsia="zh-CN"/>
+        </w:rPr>
+      </w:r>
+    </w:p>
+    <w:p>
+      <w:pPr>
+        <w:rPr>
+          <w:rFonts w:hint="eastAsia"/>
+          <w:lang w:eastAsia="zh-CN"/>
+        </w:rPr>
+      </w:pPr>
+      <w:r>
+        <w:rPr>
+          <w:lang w:eastAsia="zh-CN"/>
+        </w:rPr>
+        <w:t>20. ★ 仅保压段启用 Ki，斜坡段强制 Ki=0；相位切换时复位积分项，避免超调</w:t>
       </w:r>
       <w:proofErr w:type="gramStart"/>
       <w:r>
@@ -17990,22 +18140,8 @@
             <w:tcW w:w="3016" w:type="dxa"/>
           </w:tcPr>
           <w:p>
-            <w:pPr>
-              <w:rPr>
-                <w:rFonts w:hint="eastAsia"/>
-                <w:sz w:val="18"/>
-                <w:highlight w:val="magenta"/>
-                <w:lang w:eastAsia="zh-CN"/>
-              </w:rPr>
-            </w:pPr>
-            <w:r>
-              <w:rPr>
-                <w:rFonts w:hint="eastAsia"/>
-                <w:sz w:val="18"/>
-                <w:highlight w:val="magenta"/>
-                <w:lang w:eastAsia="zh-CN"/>
-              </w:rPr>
-              <w:t>保留</w:t>
+            <w:r>
+              <w:t>PP_Water_Burst_Kp</w:t>
             </w:r>
           </w:p>
         </w:tc>
@@ -18014,18 +18150,7 @@
             <w:tcW w:w="2474" w:type="dxa"/>
           </w:tcPr>
           <w:p>
-            <w:pPr>
-              <w:rPr>
-                <w:rFonts w:hint="eastAsia"/>
-                <w:sz w:val="18"/>
-                <w:highlight w:val="magenta"/>
-              </w:rPr>
-            </w:pPr>
-            <w:r>
-              <w:rPr>
-                <w:sz w:val="18"/>
-                <w:highlight w:val="magenta"/>
-              </w:rPr>
+            <w:r>
               <w:t>FLOAT32</w:t>
             </w:r>
           </w:p>
@@ -18035,12 +18160,9 @@
             <w:tcW w:w="2466" w:type="dxa"/>
           </w:tcPr>
           <w:p>
-            <w:pPr>
-              <w:rPr>
-                <w:rFonts w:hint="eastAsia"/>
-                <w:lang w:eastAsia="zh-CN"/>
-              </w:rPr>
-            </w:pPr>
+            <w:r>
+              <w:t>V/MPa</w:t>
+            </w:r>
           </w:p>
         </w:tc>
         <w:tc>
@@ -18048,22 +18170,8 @@
             <w:tcW w:w="2470" w:type="dxa"/>
           </w:tcPr>
           <w:p>
-            <w:pPr>
-              <w:rPr>
-                <w:rFonts w:hint="eastAsia"/>
-                <w:sz w:val="18"/>
-                <w:highlight w:val="magenta"/>
-                <w:lang w:eastAsia="zh-CN"/>
-              </w:rPr>
-            </w:pPr>
-            <w:r>
-              <w:rPr>
-                <w:rFonts w:hint="eastAsia"/>
-                <w:sz w:val="18"/>
-                <w:highlight w:val="magenta"/>
-                <w:lang w:eastAsia="zh-CN"/>
-              </w:rPr>
-              <w:t>-</w:t>
+            <w:r>
+              <w:t>★ 水路爆破 PID 比例增益</w:t>
             </w:r>
           </w:p>
         </w:tc>
@@ -18125,22 +18233,8 @@
             <w:tcW w:w="3016" w:type="dxa"/>
           </w:tcPr>
           <w:p>
-            <w:pPr>
-              <w:rPr>
-                <w:rFonts w:hint="eastAsia"/>
-                <w:sz w:val="18"/>
-                <w:highlight w:val="magenta"/>
-                <w:lang w:eastAsia="zh-CN"/>
-              </w:rPr>
-            </w:pPr>
-            <w:r>
-              <w:rPr>
-                <w:rFonts w:hint="eastAsia"/>
-                <w:sz w:val="18"/>
-                <w:highlight w:val="magenta"/>
-                <w:lang w:eastAsia="zh-CN"/>
-              </w:rPr>
-              <w:t>保留</w:t>
+            <w:r>
+              <w:t>PP_Water_Burst_Ki</w:t>
             </w:r>
           </w:p>
         </w:tc>
@@ -18149,18 +18243,7 @@
             <w:tcW w:w="2474" w:type="dxa"/>
           </w:tcPr>
           <w:p>
-            <w:pPr>
-              <w:rPr>
-                <w:rFonts w:hint="eastAsia"/>
-                <w:sz w:val="18"/>
-                <w:highlight w:val="magenta"/>
-              </w:rPr>
-            </w:pPr>
-            <w:r>
-              <w:rPr>
-                <w:sz w:val="18"/>
-                <w:highlight w:val="magenta"/>
-              </w:rPr>
+            <w:r>
               <w:t>FLOAT32</w:t>
             </w:r>
           </w:p>
@@ -18170,12 +18253,9 @@
             <w:tcW w:w="2466" w:type="dxa"/>
           </w:tcPr>
           <w:p>
-            <w:pPr>
-              <w:rPr>
-                <w:rFonts w:hint="eastAsia"/>
-                <w:lang w:eastAsia="zh-CN"/>
-              </w:rPr>
-            </w:pPr>
+            <w:r>
+              <w:t>V/MPa/s</w:t>
+            </w:r>
           </w:p>
         </w:tc>
         <w:tc>
@@ -18183,22 +18263,8 @@
             <w:tcW w:w="2470" w:type="dxa"/>
           </w:tcPr>
           <w:p>
-            <w:pPr>
-              <w:rPr>
-                <w:rFonts w:hint="eastAsia"/>
-                <w:sz w:val="18"/>
-                <w:highlight w:val="magenta"/>
-                <w:lang w:eastAsia="zh-CN"/>
-              </w:rPr>
-            </w:pPr>
-            <w:r>
-              <w:rPr>
-                <w:rFonts w:hint="eastAsia"/>
-                <w:sz w:val="18"/>
-                <w:highlight w:val="magenta"/>
-                <w:lang w:eastAsia="zh-CN"/>
-              </w:rPr>
-              <w:t>-</w:t>
+            <w:r>
+              <w:t>★ 水路爆破 PID 积分增益（仅保压段生效）</w:t>
             </w:r>
           </w:p>
         </w:tc>
@@ -18260,22 +18326,8 @@
             <w:tcW w:w="3016" w:type="dxa"/>
           </w:tcPr>
           <w:p>
-            <w:pPr>
-              <w:rPr>
-                <w:rFonts w:hint="eastAsia"/>
-                <w:sz w:val="18"/>
-                <w:highlight w:val="magenta"/>
-                <w:lang w:eastAsia="zh-CN"/>
-              </w:rPr>
-            </w:pPr>
-            <w:r>
-              <w:rPr>
-                <w:rFonts w:hint="eastAsia"/>
-                <w:sz w:val="18"/>
-                <w:highlight w:val="magenta"/>
-                <w:lang w:eastAsia="zh-CN"/>
-              </w:rPr>
-              <w:t>保留</w:t>
+            <w:r>
+              <w:t>PP_Oil_Burst_Kp</w:t>
             </w:r>
           </w:p>
         </w:tc>
@@ -18284,18 +18336,7 @@
             <w:tcW w:w="2474" w:type="dxa"/>
           </w:tcPr>
           <w:p>
-            <w:pPr>
-              <w:rPr>
-                <w:rFonts w:hint="eastAsia"/>
-                <w:sz w:val="18"/>
-                <w:highlight w:val="magenta"/>
-              </w:rPr>
-            </w:pPr>
-            <w:r>
-              <w:rPr>
-                <w:sz w:val="18"/>
-                <w:highlight w:val="magenta"/>
-              </w:rPr>
+            <w:r>
               <w:t>FLOAT32</w:t>
             </w:r>
           </w:p>
@@ -18305,12 +18346,9 @@
             <w:tcW w:w="2466" w:type="dxa"/>
           </w:tcPr>
           <w:p>
-            <w:pPr>
-              <w:rPr>
-                <w:rFonts w:hint="eastAsia"/>
-                <w:lang w:eastAsia="zh-CN"/>
-              </w:rPr>
-            </w:pPr>
+            <w:r>
+              <w:t>V/MPa</w:t>
+            </w:r>
           </w:p>
         </w:tc>
         <w:tc>
@@ -18318,22 +18356,8 @@
             <w:tcW w:w="2470" w:type="dxa"/>
           </w:tcPr>
           <w:p>
-            <w:pPr>
-              <w:rPr>
-                <w:rFonts w:hint="eastAsia"/>
-                <w:sz w:val="18"/>
-                <w:highlight w:val="magenta"/>
-                <w:lang w:eastAsia="zh-CN"/>
-              </w:rPr>
-            </w:pPr>
-            <w:r>
-              <w:rPr>
-                <w:rFonts w:hint="eastAsia"/>
-                <w:sz w:val="18"/>
-                <w:highlight w:val="magenta"/>
-                <w:lang w:eastAsia="zh-CN"/>
-              </w:rPr>
-              <w:t>-</w:t>
+            <w:r>
+              <w:t>★ 油路爆破 PID 比例增益</w:t>
             </w:r>
           </w:p>
         </w:tc>
@@ -18395,22 +18419,8 @@
             <w:tcW w:w="3016" w:type="dxa"/>
           </w:tcPr>
           <w:p>
-            <w:pPr>
-              <w:rPr>
-                <w:rFonts w:hint="eastAsia"/>
-                <w:sz w:val="18"/>
-                <w:highlight w:val="magenta"/>
-                <w:lang w:eastAsia="zh-CN"/>
-              </w:rPr>
-            </w:pPr>
-            <w:r>
-              <w:rPr>
-                <w:rFonts w:hint="eastAsia"/>
-                <w:sz w:val="18"/>
-                <w:highlight w:val="magenta"/>
-                <w:lang w:eastAsia="zh-CN"/>
-              </w:rPr>
-              <w:t>保留</w:t>
+            <w:r>
+              <w:t>PP_Oil_Burst_Ki</w:t>
             </w:r>
           </w:p>
         </w:tc>
@@ -18419,18 +18429,7 @@
             <w:tcW w:w="2474" w:type="dxa"/>
           </w:tcPr>
           <w:p>
-            <w:pPr>
-              <w:rPr>
-                <w:rFonts w:hint="eastAsia"/>
-                <w:sz w:val="18"/>
-                <w:highlight w:val="magenta"/>
-              </w:rPr>
-            </w:pPr>
-            <w:r>
-              <w:rPr>
-                <w:sz w:val="18"/>
-                <w:highlight w:val="magenta"/>
-              </w:rPr>
+            <w:r>
               <w:t>FLOAT32</w:t>
             </w:r>
           </w:p>
@@ -18440,12 +18439,9 @@
             <w:tcW w:w="2466" w:type="dxa"/>
           </w:tcPr>
           <w:p>
-            <w:pPr>
-              <w:rPr>
-                <w:rFonts w:hint="eastAsia"/>
-                <w:lang w:eastAsia="zh-CN"/>
-              </w:rPr>
-            </w:pPr>
+            <w:r>
+              <w:t>V/MPa/s</w:t>
+            </w:r>
           </w:p>
         </w:tc>
         <w:tc>
@@ -18453,22 +18449,8 @@
             <w:tcW w:w="2470" w:type="dxa"/>
           </w:tcPr>
           <w:p>
-            <w:pPr>
-              <w:rPr>
-                <w:rFonts w:hint="eastAsia"/>
-                <w:sz w:val="18"/>
-                <w:highlight w:val="magenta"/>
-                <w:lang w:eastAsia="zh-CN"/>
-              </w:rPr>
-            </w:pPr>
-            <w:r>
-              <w:rPr>
-                <w:rFonts w:hint="eastAsia"/>
-                <w:sz w:val="18"/>
-                <w:highlight w:val="magenta"/>
-                <w:lang w:eastAsia="zh-CN"/>
-              </w:rPr>
-              <w:t>-</w:t>
+            <w:r>
+              <w:t>★ 油路爆破 PID 积分增益（仅保压段生效）</w:t>
             </w:r>
           </w:p>
         </w:tc>
@@ -18530,22 +18512,8 @@
             <w:tcW w:w="3016" w:type="dxa"/>
           </w:tcPr>
           <w:p>
-            <w:pPr>
-              <w:rPr>
-                <w:rFonts w:hint="eastAsia"/>
-                <w:sz w:val="18"/>
-                <w:highlight w:val="magenta"/>
-                <w:lang w:eastAsia="zh-CN"/>
-              </w:rPr>
-            </w:pPr>
-            <w:r>
-              <w:rPr>
-                <w:rFonts w:hint="eastAsia"/>
-                <w:sz w:val="18"/>
-                <w:highlight w:val="magenta"/>
-                <w:lang w:eastAsia="zh-CN"/>
-              </w:rPr>
-              <w:t>保留</w:t>
+            <w:r>
+              <w:t>PP_Water_BurstHoldCount</w:t>
             </w:r>
           </w:p>
         </w:tc>
@@ -18554,18 +18522,7 @@
             <w:tcW w:w="2474" w:type="dxa"/>
           </w:tcPr>
           <w:p>
-            <w:pPr>
-              <w:rPr>
-                <w:rFonts w:hint="eastAsia"/>
-                <w:sz w:val="18"/>
-                <w:highlight w:val="magenta"/>
-              </w:rPr>
-            </w:pPr>
-            <w:r>
-              <w:rPr>
-                <w:sz w:val="18"/>
-                <w:highlight w:val="magenta"/>
-              </w:rPr>
+            <w:r>
               <w:t>FLOAT32</w:t>
             </w:r>
           </w:p>
@@ -18575,12 +18532,9 @@
             <w:tcW w:w="2466" w:type="dxa"/>
           </w:tcPr>
           <w:p>
-            <w:pPr>
-              <w:rPr>
-                <w:rFonts w:hint="eastAsia"/>
-                <w:lang w:eastAsia="zh-CN"/>
-              </w:rPr>
-            </w:pPr>
+            <w:r>
+              <w:t>-</w:t>
+            </w:r>
           </w:p>
         </w:tc>
         <w:tc>
@@ -18588,22 +18542,8 @@
             <w:tcW w:w="2470" w:type="dxa"/>
           </w:tcPr>
           <w:p>
-            <w:pPr>
-              <w:rPr>
-                <w:rFonts w:hint="eastAsia"/>
-                <w:sz w:val="18"/>
-                <w:highlight w:val="magenta"/>
-                <w:lang w:eastAsia="zh-CN"/>
-              </w:rPr>
-            </w:pPr>
-            <w:r>
-              <w:rPr>
-                <w:rFonts w:hint="eastAsia"/>
-                <w:sz w:val="18"/>
-                <w:highlight w:val="magenta"/>
-                <w:lang w:eastAsia="zh-CN"/>
-              </w:rPr>
-              <w:t>-</w:t>
+            <w:r>
+              <w:t>★ 水路爆破保压段数 1~10；0 或越界回落到单段(BurstPressure/HoldTime)</w:t>
             </w:r>
           </w:p>
         </w:tc>
@@ -18665,22 +18605,8 @@
             <w:tcW w:w="3016" w:type="dxa"/>
           </w:tcPr>
           <w:p>
-            <w:pPr>
-              <w:rPr>
-                <w:rFonts w:hint="eastAsia"/>
-                <w:sz w:val="18"/>
-                <w:highlight w:val="magenta"/>
-                <w:lang w:eastAsia="zh-CN"/>
-              </w:rPr>
-            </w:pPr>
-            <w:r>
-              <w:rPr>
-                <w:rFonts w:hint="eastAsia"/>
-                <w:sz w:val="18"/>
-                <w:highlight w:val="magenta"/>
-                <w:lang w:eastAsia="zh-CN"/>
-              </w:rPr>
-              <w:t>保留</w:t>
+            <w:r>
+              <w:t>PP_Oil_BurstHoldCount</w:t>
             </w:r>
           </w:p>
         </w:tc>
@@ -18689,18 +18615,7 @@
             <w:tcW w:w="2474" w:type="dxa"/>
           </w:tcPr>
           <w:p>
-            <w:pPr>
-              <w:rPr>
-                <w:rFonts w:hint="eastAsia"/>
-                <w:sz w:val="18"/>
-                <w:highlight w:val="magenta"/>
-              </w:rPr>
-            </w:pPr>
-            <w:r>
-              <w:rPr>
-                <w:sz w:val="18"/>
-                <w:highlight w:val="magenta"/>
-              </w:rPr>
+            <w:r>
               <w:t>FLOAT32</w:t>
             </w:r>
           </w:p>
@@ -18710,12 +18625,9 @@
             <w:tcW w:w="2466" w:type="dxa"/>
           </w:tcPr>
           <w:p>
-            <w:pPr>
-              <w:rPr>
-                <w:rFonts w:hint="eastAsia"/>
-                <w:lang w:eastAsia="zh-CN"/>
-              </w:rPr>
-            </w:pPr>
+            <w:r>
+              <w:t>-</w:t>
+            </w:r>
           </w:p>
         </w:tc>
         <w:tc>
@@ -18723,22 +18635,8 @@
             <w:tcW w:w="2470" w:type="dxa"/>
           </w:tcPr>
           <w:p>
-            <w:pPr>
-              <w:rPr>
-                <w:rFonts w:hint="eastAsia"/>
-                <w:sz w:val="18"/>
-                <w:highlight w:val="magenta"/>
-                <w:lang w:eastAsia="zh-CN"/>
-              </w:rPr>
-            </w:pPr>
-            <w:r>
-              <w:rPr>
-                <w:rFonts w:hint="eastAsia"/>
-                <w:sz w:val="18"/>
-                <w:highlight w:val="magenta"/>
-                <w:lang w:eastAsia="zh-CN"/>
-              </w:rPr>
-              <w:t>-</w:t>
+            <w:r>
+              <w:t>★ 油路爆破保压段数 1~10；0 或越界回落到单段</w:t>
             </w:r>
           </w:p>
         </w:tc>
@@ -19074,21 +18972,8 @@
             <w:tcW w:w="2468" w:type="dxa"/>
           </w:tcPr>
           <w:p>
-            <w:pPr>
-              <w:rPr>
-                <w:rFonts w:hint="eastAsia"/>
-                <w:lang w:eastAsia="zh-CN"/>
-              </w:rPr>
-            </w:pPr>
-            <w:r>
-              <w:t>200-</w:t>
-            </w:r>
-            <w:r>
-              <w:rPr>
-                <w:rFonts w:hint="eastAsia"/>
-                <w:lang w:eastAsia="zh-CN"/>
-              </w:rPr>
-              <w:t>1999</w:t>
+            <w:r>
+              <w:t>200-1799</w:t>
             </w:r>
           </w:p>
         </w:tc>
@@ -19097,21 +18982,8 @@
             <w:tcW w:w="2460" w:type="dxa"/>
           </w:tcPr>
           <w:p>
-            <w:pPr>
-              <w:rPr>
-                <w:rFonts w:hint="eastAsia"/>
-                <w:lang w:eastAsia="zh-CN"/>
-              </w:rPr>
-            </w:pPr>
-            <w:r>
-              <w:t>4</w:t>
-            </w:r>
-            <w:r>
-              <w:rPr>
-                <w:rFonts w:hint="eastAsia"/>
-                <w:lang w:eastAsia="zh-CN"/>
-              </w:rPr>
-              <w:t>*N</w:t>
+            <w:r>
+              <w:t>4*800</w:t>
             </w:r>
           </w:p>
         </w:tc>
@@ -19204,18 +19076,268 @@
             <w:tcW w:w="2470" w:type="dxa"/>
           </w:tcPr>
           <w:p>
-            <w:pPr>
-              <w:rPr>
-                <w:rFonts w:hint="eastAsia"/>
-                <w:lang w:eastAsia="zh-CN"/>
-              </w:rPr>
-            </w:pPr>
-            <w:r>
-              <w:rPr>
-                <w:sz w:val="18"/>
-                <w:lang w:eastAsia="zh-CN"/>
-              </w:rPr>
-              <w:t>波形数据，每点为一个周期内的目标压力值</w:t>
+            <w:r>
+              <w:t>波形数据，每点为一个周期内的目标压力值（800 点 LUT）</w:t>
+            </w:r>
+          </w:p>
+        </w:tc>
+      </w:tr>
+      <w:tr>
+        <w:trPr>
+          <w:jc w:val="center"/>
+        </w:trPr>
+        <w:tc>
+          <w:tcPr>
+            <w:tcW w:w="2468" w:type="dxa"/>
+          </w:tcPr>
+          <w:p>
+            <w:r>
+              <w:t>1800-1819</w:t>
+            </w:r>
+          </w:p>
+        </w:tc>
+        <w:tc>
+          <w:tcPr>
+            <w:tcW w:w="2460" w:type="dxa"/>
+          </w:tcPr>
+          <w:p>
+            <w:r>
+              <w:t>4*10</w:t>
+            </w:r>
+          </w:p>
+        </w:tc>
+        <w:tc>
+          <w:tcPr>
+            <w:tcW w:w="3016" w:type="dxa"/>
+          </w:tcPr>
+          <w:p>
+            <w:r>
+              <w:t>PP_Water_BurstHoldP[1..10]</w:t>
+            </w:r>
+          </w:p>
+        </w:tc>
+        <w:tc>
+          <w:tcPr>
+            <w:tcW w:w="2474" w:type="dxa"/>
+          </w:tcPr>
+          <w:p>
+            <w:r>
+              <w:t>FLOAT32</w:t>
+            </w:r>
+          </w:p>
+        </w:tc>
+        <w:tc>
+          <w:tcPr>
+            <w:tcW w:w="2466" w:type="dxa"/>
+          </w:tcPr>
+          <w:p>
+            <w:r>
+              <w:t>MPa</w:t>
+            </w:r>
+          </w:p>
+        </w:tc>
+        <w:tc>
+          <w:tcPr>
+            <w:tcW w:w="2470" w:type="dxa"/>
+          </w:tcPr>
+          <w:p>
+            <w:r>
+              <w:t>★ 水路爆破各段目标压力</w:t>
+            </w:r>
+          </w:p>
+        </w:tc>
+      </w:tr>
+      <w:tr>
+        <w:trPr>
+          <w:jc w:val="center"/>
+        </w:trPr>
+        <w:tc>
+          <w:tcPr>
+            <w:tcW w:w="2468" w:type="dxa"/>
+          </w:tcPr>
+          <w:p>
+            <w:r>
+              <w:t>1820-1839</w:t>
+            </w:r>
+          </w:p>
+        </w:tc>
+        <w:tc>
+          <w:tcPr>
+            <w:tcW w:w="2460" w:type="dxa"/>
+          </w:tcPr>
+          <w:p>
+            <w:r>
+              <w:t>4*10</w:t>
+            </w:r>
+          </w:p>
+        </w:tc>
+        <w:tc>
+          <w:tcPr>
+            <w:tcW w:w="3016" w:type="dxa"/>
+          </w:tcPr>
+          <w:p>
+            <w:r>
+              <w:t>PP_Water_BurstHoldT[1..10]</w:t>
+            </w:r>
+          </w:p>
+        </w:tc>
+        <w:tc>
+          <w:tcPr>
+            <w:tcW w:w="2474" w:type="dxa"/>
+          </w:tcPr>
+          <w:p>
+            <w:r>
+              <w:t>FLOAT32</w:t>
+            </w:r>
+          </w:p>
+        </w:tc>
+        <w:tc>
+          <w:tcPr>
+            <w:tcW w:w="2466" w:type="dxa"/>
+          </w:tcPr>
+          <w:p>
+            <w:r>
+              <w:t>s</w:t>
+            </w:r>
+          </w:p>
+        </w:tc>
+        <w:tc>
+          <w:tcPr>
+            <w:tcW w:w="2470" w:type="dxa"/>
+          </w:tcPr>
+          <w:p>
+            <w:r>
+              <w:t>★ 水路爆破各段保压时长</w:t>
+            </w:r>
+          </w:p>
+        </w:tc>
+      </w:tr>
+      <w:tr>
+        <w:trPr>
+          <w:jc w:val="center"/>
+        </w:trPr>
+        <w:tc>
+          <w:tcPr>
+            <w:tcW w:w="2468" w:type="dxa"/>
+          </w:tcPr>
+          <w:p>
+            <w:r>
+              <w:t>1840-1859</w:t>
+            </w:r>
+          </w:p>
+        </w:tc>
+        <w:tc>
+          <w:tcPr>
+            <w:tcW w:w="2460" w:type="dxa"/>
+          </w:tcPr>
+          <w:p>
+            <w:r>
+              <w:t>4*10</w:t>
+            </w:r>
+          </w:p>
+        </w:tc>
+        <w:tc>
+          <w:tcPr>
+            <w:tcW w:w="3016" w:type="dxa"/>
+          </w:tcPr>
+          <w:p>
+            <w:r>
+              <w:t>PP_Oil_BurstHoldP[1..10]</w:t>
+            </w:r>
+          </w:p>
+        </w:tc>
+        <w:tc>
+          <w:tcPr>
+            <w:tcW w:w="2474" w:type="dxa"/>
+          </w:tcPr>
+          <w:p>
+            <w:r>
+              <w:t>FLOAT32</w:t>
+            </w:r>
+          </w:p>
+        </w:tc>
+        <w:tc>
+          <w:tcPr>
+            <w:tcW w:w="2466" w:type="dxa"/>
+          </w:tcPr>
+          <w:p>
+            <w:r>
+              <w:t>MPa</w:t>
+            </w:r>
+          </w:p>
+        </w:tc>
+        <w:tc>
+          <w:tcPr>
+            <w:tcW w:w="2470" w:type="dxa"/>
+          </w:tcPr>
+          <w:p>
+            <w:r>
+              <w:t>★ 油路爆破各段目标压力</w:t>
+            </w:r>
+          </w:p>
+        </w:tc>
+      </w:tr>
+      <w:tr>
+        <w:trPr>
+          <w:jc w:val="center"/>
+        </w:trPr>
+        <w:tc>
+          <w:tcPr>
+            <w:tcW w:w="2468" w:type="dxa"/>
+          </w:tcPr>
+          <w:p>
+            <w:r>
+              <w:t>1860-1879</w:t>
+            </w:r>
+          </w:p>
+        </w:tc>
+        <w:tc>
+          <w:tcPr>
+            <w:tcW w:w="2460" w:type="dxa"/>
+          </w:tcPr>
+          <w:p>
+            <w:r>
+              <w:t>4*10</w:t>
+            </w:r>
+          </w:p>
+        </w:tc>
+        <w:tc>
+          <w:tcPr>
+            <w:tcW w:w="3016" w:type="dxa"/>
+          </w:tcPr>
+          <w:p>
+            <w:r>
+              <w:t>PP_Oil_BurstHoldT[1..10]</w:t>
+            </w:r>
+          </w:p>
+        </w:tc>
+        <w:tc>
+          <w:tcPr>
+            <w:tcW w:w="2474" w:type="dxa"/>
+          </w:tcPr>
+          <w:p>
+            <w:r>
+              <w:t>FLOAT32</w:t>
+            </w:r>
+          </w:p>
+        </w:tc>
+        <w:tc>
+          <w:tcPr>
+            <w:tcW w:w="2466" w:type="dxa"/>
+          </w:tcPr>
+          <w:p>
+            <w:r>
+              <w:t>s</w:t>
+            </w:r>
+          </w:p>
+        </w:tc>
+        <w:tc>
+          <w:tcPr>
+            <w:tcW w:w="2470" w:type="dxa"/>
+          </w:tcPr>
+          <w:p>
+            <w:r>
+              <w:t>★ 油路爆破各段保压时长</w:t>
             </w:r>
           </w:p>
         </w:tc>

</xml_diff>

<commit_message>
Burst phase 5 = standby
PLC boots with iBurstPhase = 5; the run command (iCmd=2 in burst
mode) drops it back to 5 instead of 0. The state-3 burst block adds
case 5 that just initialises rBurstSetpoint and iHoldIdx then jumps
to phase 0 — so the upper computer sees 5 throughout state-2 cylinder
homing, and only moves to 0 once the system actually starts ramping.

GVL comments and the V4.0 doc (Table 2 BurstPhase rows + a new
changelog bullet) updated to list the 5=待机 value.
</commit_message>
<xml_diff>
--- a/压力脉冲控制器TCP-IP通讯协议表V4.0.docx
+++ b/压力脉冲控制器TCP-IP通讯协议表V4.0.docx
@@ -749,6 +749,56 @@
         <w:rPr>
           <w:lang w:eastAsia="zh-CN"/>
         </w:rPr>
+        <w:t>21. ★ 爆破相位增加待机状态 5=待机，PLC 上电及收到运行命令后先停在 5，进入运行状态后切到 0 升压</w:t>
+      </w:r>
+      <w:proofErr w:type="gramStart"/>
+      <w:r>
+        <w:rPr>
+          <w:lang w:eastAsia="zh-CN"/>
+        </w:rPr>
+      </w:r>
+      <w:proofErr w:type="gramEnd"/>
+      <w:r>
+        <w:rPr>
+          <w:lang w:eastAsia="zh-CN"/>
+        </w:rPr>
+      </w:r>
+      <w:proofErr w:type="spellStart"/>
+      <w:r>
+        <w:rPr>
+          <w:lang w:eastAsia="zh-CN"/>
+        </w:rPr>
+      </w:r>
+      <w:proofErr w:type="spellEnd"/>
+      <w:r>
+        <w:rPr>
+          <w:lang w:eastAsia="zh-CN"/>
+        </w:rPr>
+      </w:r>
+      <w:proofErr w:type="gramStart"/>
+      <w:r>
+        <w:rPr>
+          <w:lang w:eastAsia="zh-CN"/>
+        </w:rPr>
+      </w:r>
+      <w:proofErr w:type="gramEnd"/>
+      <w:r>
+        <w:rPr>
+          <w:lang w:eastAsia="zh-CN"/>
+        </w:rPr>
+      </w:r>
+    </w:p>
+    <w:p>
+      <w:pPr>
+        <w:rPr>
+          <w:rFonts w:hint="eastAsia"/>
+          <w:lang w:eastAsia="zh-CN"/>
+        </w:rPr>
+      </w:pPr>
+      <w:r>
+        <w:rPr>
+          <w:lang w:eastAsia="zh-CN"/>
+        </w:rPr>
         <w:t>PID 控制器参数设定指南</w:t>
       </w:r>
       <w:proofErr w:type="gramStart"/>
@@ -40546,7 +40596,7 @@
           </w:tcPr>
           <w:p>
             <w:r>
-              <w:t>★ 水路爆破相位 0=升压 1=保压 2=续升 3=已爆破 4=到上限未爆破</w:t>
+              <w:t>★ 水路爆破相位 5=待机 0=升压 1=保压 2=续升 3=已爆破 4=到上限未爆破</w:t>
             </w:r>
           </w:p>
         </w:tc>
@@ -40676,7 +40726,7 @@
           </w:tcPr>
           <w:p>
             <w:r>
-              <w:t>★ 油路爆破相位 0=升压 1=保压 2=续升 3=已爆破 4=到上限未爆破</w:t>
+              <w:t>★ 油路爆破相位 5=待机 0=升压 1=保压 2=续升 3=已爆破 4=到上限未爆破</w:t>
             </w:r>
           </w:p>
         </w:tc>

</xml_diff>

<commit_message>
Expose an ILC-learning-in-progress flag to the PC
After each fbILC_W/O call, PRG_PressureControl now publishes
PP_Water_ILC_Learning / PP_Oil_ILC_Learning: 1.0 when ILC is enabled
and not yet converged (still learning, including warmup cycles),
0.0 when disabled or already converged.

TCP_PLC_to_PC ships these out on the previously-reserved ADRC_Output
slots (WORD 46-47 water, 76-77 oil); the second halves of those 4-WORD
blocks (48-49 / 78-79) remain reserved.

Doc V4.0 updated with the two row entries and a changelog bullet.
</commit_message>
<xml_diff>
--- a/压力脉冲控制器TCP-IP通讯协议表V4.0.docx
+++ b/压力脉冲控制器TCP-IP通讯协议表V4.0.docx
@@ -799,6 +799,56 @@
         <w:rPr>
           <w:lang w:eastAsia="zh-CN"/>
         </w:rPr>
+        <w:t>22. ★ 新增 ILC 自学习中标志 PP_*_ILC_Learning（WORD 46-47 水、76-77 油），1=学习中 0=空闲/已收敛</w:t>
+      </w:r>
+      <w:proofErr w:type="gramStart"/>
+      <w:r>
+        <w:rPr>
+          <w:lang w:eastAsia="zh-CN"/>
+        </w:rPr>
+      </w:r>
+      <w:proofErr w:type="gramEnd"/>
+      <w:r>
+        <w:rPr>
+          <w:lang w:eastAsia="zh-CN"/>
+        </w:rPr>
+      </w:r>
+      <w:proofErr w:type="spellStart"/>
+      <w:r>
+        <w:rPr>
+          <w:lang w:eastAsia="zh-CN"/>
+        </w:rPr>
+      </w:r>
+      <w:proofErr w:type="spellEnd"/>
+      <w:r>
+        <w:rPr>
+          <w:lang w:eastAsia="zh-CN"/>
+        </w:rPr>
+      </w:r>
+      <w:proofErr w:type="gramStart"/>
+      <w:r>
+        <w:rPr>
+          <w:lang w:eastAsia="zh-CN"/>
+        </w:rPr>
+      </w:r>
+      <w:proofErr w:type="gramEnd"/>
+      <w:r>
+        <w:rPr>
+          <w:lang w:eastAsia="zh-CN"/>
+        </w:rPr>
+      </w:r>
+    </w:p>
+    <w:p>
+      <w:pPr>
+        <w:rPr>
+          <w:rFonts w:hint="eastAsia"/>
+          <w:lang w:eastAsia="zh-CN"/>
+        </w:rPr>
+      </w:pPr>
+      <w:r>
+        <w:rPr>
+          <w:lang w:eastAsia="zh-CN"/>
+        </w:rPr>
         <w:t>PID 控制器参数设定指南</w:t>
       </w:r>
       <w:proofErr w:type="gramStart"/>
@@ -21853,7 +21903,7 @@
           </w:tcPr>
           <w:p>
             <w:r>
-              <w:t>保留</w:t>
+              <w:t>PP_Water_ILC_Learning</w:t>
             </w:r>
           </w:p>
         </w:tc>
@@ -21883,7 +21933,7 @@
           </w:tcPr>
           <w:p>
             <w:r>
-              <w:t>原 PP_Water_ADRC_Output，V4.0 起 ADRC 已删</w:t>
+              <w:t>★ 水路 ILC 自学习中标志 1=学习中 0=空闲/已收敛</w:t>
             </w:r>
           </w:p>
         </w:tc>
@@ -23238,7 +23288,7 @@
           </w:tcPr>
           <w:p>
             <w:r>
-              <w:t>保留</w:t>
+              <w:t>PP_Oil_ILC_Learning</w:t>
             </w:r>
           </w:p>
         </w:tc>
@@ -23268,7 +23318,7 @@
           </w:tcPr>
           <w:p>
             <w:r>
-              <w:t>原 PP_Oil_ADRC_Output，V4.0 起 ADRC 已删</w:t>
+              <w:t>★ 油路 ILC 自学习中标志 1=学习中 0=空闲/已收敛</w:t>
             </w:r>
           </w:p>
         </w:tc>

</xml_diff>

<commit_message>
Doc V4.0: scrub stale entries from changelog and tuning guide
- #8 was about BurstRate2 (deleted in 8a318cc) — rephrased to note
  rise and continue ramps share one RiseRate
- #15/#16 were stuck on one line — split for readability
- #17 listed BurstMaxLimit at WORD 180-183, but it moved to 66-67 /
  114-115 in b96345c; updated to match
- #14 referenced RiseTime (now RiseRate); reworded
- 爆破试验设定 section rewritten to reflect the current burst variables
  (Burst_Kp/Ki, RiseRate, BurstHoldCount, BurstHoldP[], BurstHoldT[],
  BurstMaxLimit) + the 5→0→1→2→3/4 phase flow
- PID_Kp/Ki guidance lines now cover both pulse and burst PID
</commit_message>
<xml_diff>
--- a/压力脉冲控制器TCP-IP通讯协议表V4.0.docx
+++ b/压力脉冲控制器TCP-IP通讯协议表V4.0.docx
@@ -349,7 +349,7 @@
         </w:rPr>
       </w:pPr>
       <w:r>
-        <w:t>8. ★ 新增 BurstRate2（续升速率）输入和 BurstResult/BurstPhase 回读</w:t>
+        <w:t>8. ★ 爆破续升与初始升压共用同一 RiseRate（MPa/s）</w:t>
       </w:r>
     </w:p>
     <w:p>
@@ -485,7 +485,7 @@
         <w:rPr>
           <w:lang w:eastAsia="zh-CN"/>
         </w:rPr>
-        <w:t>14. ★ V2.2 兼容：MinPressure 参数和爆破基础参数（BurstPressure/RiseTime/HoldTime）继承不变</w:t>
+        <w:t>14. ★ 旧参数 BurstPressure / RiseTime / HoldTime → 改为 BurstHoldP[1]/RiseRate/BurstHoldT[1]，单段时可兼容自动回落</w:t>
       </w:r>
     </w:p>
     <w:p>
@@ -499,7 +499,7 @@
         <w:rPr>
           <w:lang w:eastAsia="zh-CN"/>
         </w:rPr>
-        <w:t>15. ★ 滤波时间常数调整：水路 50ms→20ms，油路 100ms→50ms；16. ★ 冲洗排气拆分水/剂两路独立控制（油路输出 +3V/−0.5V）</w:t>
+        <w:t>15. ★ 滤波时间常数调整：水路 50ms→20ms，油路 100ms→50ms</w:t>
       </w:r>
       <w:proofErr w:type="gramStart"/>
       <w:r>
@@ -549,7 +549,57 @@
         <w:rPr>
           <w:lang w:eastAsia="zh-CN"/>
         </w:rPr>
-        <w:t>17. ★ 新增爆破最大安全压力 BurstMaxLimit（WORD 180-183），到限自动停机并标记 BurstPhase=4</w:t>
+        <w:t>16. ★ 冲洗排气拆分水/剂两路独立控制（油路输出 +3V/−0.5V）</w:t>
+      </w:r>
+      <w:proofErr w:type="gramStart"/>
+      <w:r>
+        <w:rPr>
+          <w:lang w:eastAsia="zh-CN"/>
+        </w:rPr>
+      </w:r>
+      <w:proofErr w:type="gramEnd"/>
+      <w:r>
+        <w:rPr>
+          <w:lang w:eastAsia="zh-CN"/>
+        </w:rPr>
+      </w:r>
+      <w:proofErr w:type="spellStart"/>
+      <w:r>
+        <w:rPr>
+          <w:lang w:eastAsia="zh-CN"/>
+        </w:rPr>
+      </w:r>
+      <w:proofErr w:type="spellEnd"/>
+      <w:r>
+        <w:rPr>
+          <w:lang w:eastAsia="zh-CN"/>
+        </w:rPr>
+      </w:r>
+      <w:proofErr w:type="gramStart"/>
+      <w:r>
+        <w:rPr>
+          <w:lang w:eastAsia="zh-CN"/>
+        </w:rPr>
+      </w:r>
+      <w:proofErr w:type="gramEnd"/>
+      <w:r>
+        <w:rPr>
+          <w:lang w:eastAsia="zh-CN"/>
+        </w:rPr>
+      </w:r>
+    </w:p>
+    <w:p>
+      <w:pPr>
+        <w:rPr>
+          <w:rFonts w:hint="eastAsia"/>
+          <w:lang w:eastAsia="zh-CN"/>
+        </w:rPr>
+      </w:pPr>
+      <w:r>
+        <w:rPr>
+          <w:lang w:eastAsia="zh-CN"/>
+        </w:rPr>
+        <w:t>17. ★ 新增爆破最大安全压力 BurstMaxLimit（水 WORD 66-67、油 114-115），到限自动停机并标记 BurstPhase=4</w:t>
       </w:r>
       <w:proofErr w:type="gramStart"/>
       <w:r>
@@ -915,7 +965,7 @@
         <w:rPr>
           <w:lang w:eastAsia="zh-CN"/>
         </w:rPr>
-        <w:t xml:space="preserve">  - PID_Kp：比例增益(V/MPa)，建议从 0.3 起步，逐步加大直到响应稳定无振荡</w:t>
+        <w:t xml:space="preserve">  - PID_Kp / Burst_Kp：比例增益(V/MPa)，建议从 0.3 起步，逐步加大直到响应稳定无振荡</w:t>
       </w:r>
     </w:p>
     <w:p>
@@ -929,7 +979,7 @@
         <w:rPr>
           <w:lang w:eastAsia="zh-CN"/>
         </w:rPr>
-        <w:t xml:space="preserve">  - PID_Ki：积分增益(V/MPa/s)，建议先置 0，待 Kp 调好后小幅加入消除稳态误差</w:t>
+        <w:t xml:space="preserve">  - PID_Ki / Burst_Ki：积分增益(V/MPa/s)，建议先置 0，待 Kp 调好后小幅加入消除残差</w:t>
       </w:r>
       <w:proofErr w:type="spellStart"/>
       <w:r>
@@ -1071,7 +1121,7 @@
         </w:rPr>
       </w:pPr>
       <w:r>
-        <w:t xml:space="preserve">  - BurstPressure (MPa)：保压平台压力</w:t>
+        <w:t xml:space="preserve">  - Burst_Kp / Burst_Ki：爆破独立 PID 增益（与脉冲 PID 分离），仅保压段启用 Ki</w:t>
       </w:r>
     </w:p>
     <w:p>
@@ -1081,7 +1131,7 @@
         </w:rPr>
       </w:pPr>
       <w:r>
-        <w:t xml:space="preserve">  - RiseTime (s)：0 → BurstPressure 的升压耗时；速率 rate1 = BurstPressure / RiseTime</w:t>
+        <w:t xml:space="preserve">  - RiseRate (MPa/s)：升压速率，初始升压与续升共用</w:t>
       </w:r>
     </w:p>
     <w:p>
@@ -1091,7 +1141,7 @@
         </w:rPr>
       </w:pPr>
       <w:r>
-        <w:t xml:space="preserve">  - HoldTime (s)：在 BurstPressure 上保压时间</w:t>
+        <w:t xml:space="preserve">  - BurstHoldCount：保压段数 1~10；0 或越界时回落到单段(BurstPressure/HoldTime)</w:t>
       </w:r>
     </w:p>
     <w:p>
@@ -1101,7 +1151,7 @@
         </w:rPr>
       </w:pPr>
       <w:r>
-        <w:t xml:space="preserve">  - BurstRate2 (MPa/s)：保压结束后的续升速率；为 0 时回落到 rate1</w:t>
+        <w:t xml:space="preserve">  - BurstHoldP[1..N]：各段目标压力 (MPa)</w:t>
       </w:r>
     </w:p>
     <w:p>
@@ -1111,7 +1161,7 @@
         </w:rPr>
       </w:pPr>
       <w:r>
-        <w:t xml:space="preserve">  - 检测后自动停机，PP_*_BurstResult 锁存爆破压力，PP_*_BurstPhase 显示当前相位</w:t>
+        <w:t xml:space="preserve">  - BurstHoldT[1..N]：各段保压时长 (s)</w:t>
       </w:r>
     </w:p>
     <w:p>
@@ -1120,7 +1170,29 @@
           <w:rFonts w:hint="eastAsia"/>
         </w:rPr>
       </w:pPr>
-      <w:r/>
+      <w:r>
+        <w:t xml:space="preserve">  - BurstMaxLimit (MPa)：安全上限，给定到此停机并标记 BurstPhase=4</w:t>
+      </w:r>
+    </w:p>
+    <w:p>
+      <w:pPr>
+        <w:rPr>
+          <w:rFonts w:hint="eastAsia"/>
+        </w:rPr>
+      </w:pPr>
+      <w:r>
+        <w:t xml:space="preserve">  - 流程：5 待机 → 0 升压到 P[k] → 1 保压 → (下一段) 或 2 续升 → 3 已爆破 / 4 到上限</w:t>
+      </w:r>
+    </w:p>
+    <w:p>
+      <w:pPr>
+        <w:rPr>
+          <w:rFonts w:hint="eastAsia"/>
+        </w:rPr>
+      </w:pPr>
+      <w:r>
+        <w:t xml:space="preserve">  - 检测：实际压力 &lt; 峰值×70% 或 跌速 &lt; −20 MPa/s 触发；PP_*_BurstResult 锁存峰值压力</w:t>
+      </w:r>
     </w:p>
     <w:p>
       <w:pPr>

</xml_diff>

<commit_message>
Remove BurstPressure / HoldTime — superseded by BurstHoldP[1] / BurstHoldT[1]
The single-segment fallback was the only consumer of these four
variables; clamping BurstHoldCount to [1,10] handles the same case
without a second source of truth.

GVL: four declarations dropped.
PRG_PressureControl: fallback branch in both burst blocks replaced
with a clamp + straight array read; state-3 comment refreshed.
TCP_PC_to_PLC: slots 60-61, 64-65, 108-109, 112-113 marked 保留.
Doc V4.0: corresponding rows show "保留" with cross-reference to the
WORD 1800+ array slots; changelog #14 rewritten; tuning-guide
HoldCount line drops the fallback wording.
</commit_message>
<xml_diff>
--- a/压力脉冲控制器TCP-IP通讯协议表V4.0.docx
+++ b/压力脉冲控制器TCP-IP通讯协议表V4.0.docx
@@ -485,7 +485,7 @@
         <w:rPr>
           <w:lang w:eastAsia="zh-CN"/>
         </w:rPr>
-        <w:t>14. ★ 旧参数 BurstPressure / RiseTime / HoldTime → 改为 BurstHoldP[1]/RiseRate/BurstHoldT[1]，单段时可兼容自动回落</w:t>
+        <w:t>14. ★ 原 BurstPressure / HoldTime 已删除，统一改用 BurstHoldP[1..N] / BurstHoldT[1..N]</w:t>
       </w:r>
     </w:p>
     <w:p>
@@ -1141,7 +1141,7 @@
         </w:rPr>
       </w:pPr>
       <w:r>
-        <w:t xml:space="preserve">  - BurstHoldCount：保压段数 1~10；0 或越界时回落到单段(BurstPressure/HoldTime)</w:t>
+        <w:t xml:space="preserve">  - BurstHoldCount：保压段数 1~10；越界自动钳到 [1,10]</w:t>
       </w:r>
     </w:p>
     <w:p>
@@ -4579,7 +4579,7 @@
           </w:tcPr>
           <w:p>
             <w:r>
-              <w:t>PP_Water_BurstPressure</w:t>
+              <w:t>保留</w:t>
             </w:r>
           </w:p>
         </w:tc>
@@ -4599,7 +4599,7 @@
           </w:tcPr>
           <w:p>
             <w:r>
-              <w:t>MPa</w:t>
+              <w:t>-</w:t>
             </w:r>
           </w:p>
         </w:tc>
@@ -4609,7 +4609,7 @@
           </w:tcPr>
           <w:p>
             <w:r>
-              <w:t>水路爆破模式目标压力（保压平台）</w:t>
+              <w:t>原 PP_Water_BurstPressure，V4 起由 BurstHoldP[1] (WORD 1800-1801) 取代</w:t>
             </w:r>
           </w:p>
         </w:tc>
@@ -4729,7 +4729,7 @@
           </w:tcPr>
           <w:p>
             <w:r>
-              <w:t>PP_Water_HoldTime</w:t>
+              <w:t>保留</w:t>
             </w:r>
           </w:p>
         </w:tc>
@@ -4749,7 +4749,7 @@
           </w:tcPr>
           <w:p>
             <w:r>
-              <w:t>s</w:t>
+              <w:t>-</w:t>
             </w:r>
           </w:p>
         </w:tc>
@@ -4759,7 +4759,7 @@
           </w:tcPr>
           <w:p>
             <w:r>
-              <w:t>水路爆破保压时间</w:t>
+              <w:t>原 PP_Water_HoldTime，V4 起由 BurstHoldT[1] (WORD 1820-1821) 取代</w:t>
             </w:r>
           </w:p>
         </w:tc>
@@ -6708,7 +6708,7 @@
           </w:tcPr>
           <w:p>
             <w:r>
-              <w:t>PP_Oil_BurstPressure</w:t>
+              <w:t>保留</w:t>
             </w:r>
           </w:p>
         </w:tc>
@@ -6728,7 +6728,7 @@
           </w:tcPr>
           <w:p>
             <w:r>
-              <w:t>MPa</w:t>
+              <w:t>-</w:t>
             </w:r>
           </w:p>
         </w:tc>
@@ -6738,7 +6738,7 @@
           </w:tcPr>
           <w:p>
             <w:r>
-              <w:t>油路爆破模式目标压力（保压平台）</w:t>
+              <w:t>原 PP_Oil_BurstPressure，V4 起由 BurstHoldP[1] (WORD 1840-1841) 取代</w:t>
             </w:r>
           </w:p>
         </w:tc>
@@ -6858,7 +6858,7 @@
           </w:tcPr>
           <w:p>
             <w:r>
-              <w:t>PP_Oil_HoldTime</w:t>
+              <w:t>保留</w:t>
             </w:r>
           </w:p>
         </w:tc>
@@ -6878,7 +6878,7 @@
           </w:tcPr>
           <w:p>
             <w:r>
-              <w:t>s</w:t>
+              <w:t>-</w:t>
             </w:r>
           </w:p>
         </w:tc>
@@ -6888,7 +6888,7 @@
           </w:tcPr>
           <w:p>
             <w:r>
-              <w:t>油路爆破保压时间</w:t>
+              <w:t>原 PP_Oil_HoldTime，V4 起由 BurstHoldT[1] (WORD 1860-1861) 取代</w:t>
             </w:r>
           </w:p>
         </w:tc>

</xml_diff>

<commit_message>
Doc V4.0: refresh RiseRate description (was still referencing BurstPressure)
WORD 62-63 / 110-111 description used to say "初始 0→BurstPressure
阶段", which became stale when BurstPressure was retired in favour of
the BurstHoldP array. RiseRate is still in use across all ramp paths
(initial rise, inter-segment transition, post-hold continue ramp);
description rewritten to match.
</commit_message>
<xml_diff>
--- a/压力脉冲控制器TCP-IP通讯协议表V4.0.docx
+++ b/压力脉冲控制器TCP-IP通讯协议表V4.0.docx
@@ -4684,7 +4684,7 @@
           </w:tcPr>
           <w:p>
             <w:r>
-              <w:t>★ 水路爆破升压速率（初始 0→BurstPressure 阶段）</w:t>
+              <w:t>★ 水路爆破升压/降压速率（升压、段间过渡、续升相位共用）</w:t>
             </w:r>
           </w:p>
         </w:tc>
@@ -6813,7 +6813,7 @@
           </w:tcPr>
           <w:p>
             <w:r>
-              <w:t>★ 油路爆破升压速率（初始 0→BurstPressure 阶段）</w:t>
+              <w:t>★ 油路爆破升压/降压速率（升压、段间过渡、续升相位共用）</w:t>
             </w:r>
           </w:p>
         </w:tc>

</xml_diff>